<commit_message>
abstract, book chapter @ 250628-043932
</commit_message>
<xml_diff>
--- a/web/abstract-250627.docx
+++ b/web/abstract-250627.docx
@@ -32,7 +32,7 @@
         <w:t xml:space="preserve">The Adoption of AI in Strategic Communications</w:t>
       </w:r>
       <w:r>
-        <w:t xml:space="preserve">;\</w:t>
+        <w:t xml:space="preserve">;</w:t>
       </w:r>
       <w:r>
         <w:t xml:space="preserve"> </w:t>
@@ -76,7 +76,7 @@
         <w:pStyle w:val="Date"/>
       </w:pPr>
       <w:r>
-        <w:t xml:space="preserve">2025-06-27</w:t>
+        <w:t xml:space="preserve">2025-06-28</w:t>
       </w:r>
     </w:p>
     <w:bookmarkStart w:id="20" w:name="abstract"/>

</xml_diff>

<commit_message>
abstract, book chapter @ 250628-095104
</commit_message>
<xml_diff>
--- a/web/abstract-250627.docx
+++ b/web/abstract-250627.docx
@@ -232,7 +232,7 @@
       </w:r>
     </w:p>
     <w:bookmarkEnd w:id="20"/>
-    <w:bookmarkStart w:id="21" w:name="first-author-bio-nils-holmberg"/>
+    <w:bookmarkStart w:id="24" w:name="first-author-bio-nils-holmberg"/>
     <w:p>
       <w:pPr>
         <w:pStyle w:val="Heading2"/>
@@ -241,17 +241,72 @@
         <w:t xml:space="preserve">First author bio: Nils Holmberg</w:t>
       </w:r>
     </w:p>
-    <w:bookmarkEnd w:id="21"/>
-    <w:bookmarkStart w:id="22" w:name="second-author-bio-jörgen-eksell"/>
     <w:p>
       <w:pPr>
+        <w:pStyle w:val="FirstParagraph"/>
+      </w:pPr>
+      <w:r>
+        <w:drawing>
+          <wp:inline>
+            <wp:extent cx="1905000" cy="1905000"/>
+            <wp:effectExtent b="0" l="0" r="0" t="0"/>
+            <wp:docPr descr="" title="" id="22" name="Picture"/>
+            <a:graphic>
+              <a:graphicData uri="http://schemas.openxmlformats.org/drawingml/2006/picture">
+                <pic:pic>
+                  <pic:nvPicPr>
+                    <pic:cNvPr descr="Inst1443-quadratic-small.jpg" id="23" name="Picture"/>
+                    <pic:cNvPicPr>
+                      <a:picLocks noChangeArrowheads="1" noChangeAspect="1"/>
+                    </pic:cNvPicPr>
+                  </pic:nvPicPr>
+                  <pic:blipFill>
+                    <a:blip r:embed="rId21"/>
+                    <a:stretch>
+                      <a:fillRect/>
+                    </a:stretch>
+                  </pic:blipFill>
+                  <pic:spPr bwMode="auto">
+                    <a:xfrm>
+                      <a:off x="0" y="0"/>
+                      <a:ext cx="1905000" cy="1905000"/>
+                    </a:xfrm>
+                    <a:prstGeom prst="rect">
+                      <a:avLst/>
+                    </a:prstGeom>
+                    <a:noFill/>
+                    <a:ln w="9525">
+                      <a:noFill/>
+                      <a:headEnd/>
+                      <a:tailEnd/>
+                    </a:ln>
+                  </pic:spPr>
+                </pic:pic>
+              </a:graphicData>
+            </a:graphic>
+          </wp:inline>
+        </w:drawing>
+      </w:r>
+    </w:p>
+    <w:p>
+      <w:pPr>
+        <w:pStyle w:val="BodyText"/>
+      </w:pPr>
+      <w:r>
+        <w:t xml:space="preserve">Nils Holmberg holds a PhD in Media and Communication Science from Lund University (2016). His dissertation investigated how web advertising affects children aged 9–12 when solving online tasks, using experimental methods and eye-tracking to assess visual attention and comprehension. The study contributed to understanding the complex digital marketing ecosystem and the use of physiological methods in communication research. His current research focuses on computational content analysis for the social sciences, applying quantitative methods to extract and visualize content features from digital texts and images. This work explores how techniques like natural language processing and computer vision can help analyze communication patterns related to societal issues.</w:t>
+      </w:r>
+    </w:p>
+    <w:bookmarkEnd w:id="24"/>
+    <w:bookmarkStart w:id="25" w:name="second-author-bio-jörgen-eksell"/>
+    <w:p>
+      <w:pPr>
         <w:pStyle w:val="Heading2"/>
       </w:pPr>
       <w:r>
         <w:t xml:space="preserve">Second author bio: Jörgen Eksell</w:t>
       </w:r>
     </w:p>
-    <w:bookmarkEnd w:id="22"/>
+    <w:bookmarkEnd w:id="25"/>
     <w:sectPr>
       <w:footnotePr>
         <w:numRestart w:val="eachSect"/>

</xml_diff>

<commit_message>
abstract, book chapter @ 250628-102304
</commit_message>
<xml_diff>
--- a/web/abstract-250627.docx
+++ b/web/abstract-250627.docx
@@ -232,7 +232,7 @@
       </w:r>
     </w:p>
     <w:bookmarkEnd w:id="20"/>
-    <w:bookmarkStart w:id="24" w:name="first-author-bio-nils-holmberg"/>
+    <w:bookmarkStart w:id="25" w:name="first-author-bio-nils-holmberg"/>
     <w:p>
       <w:pPr>
         <w:pStyle w:val="Heading2"/>
@@ -293,20 +293,31 @@
         <w:pStyle w:val="BodyText"/>
       </w:pPr>
       <w:r>
-        <w:t xml:space="preserve">Nils Holmberg holds a PhD in Media and Communication Science from Lund University (2016). His dissertation investigated how web advertising affects children aged 9–12 when solving online tasks, using experimental methods and eye-tracking to assess visual attention and comprehension. The study contributed to understanding the complex digital marketing ecosystem and the use of physiological methods in communication research. His current research focuses on computational content analysis for the social sciences, applying quantitative methods to extract and visualize content features from digital texts and images. This work explores how techniques like natural language processing and computer vision can help analyze communication patterns related to societal issues.</w:t>
-      </w:r>
-    </w:p>
-    <w:bookmarkEnd w:id="24"/>
-    <w:bookmarkStart w:id="25" w:name="second-author-bio-jörgen-eksell"/>
-    <w:p>
-      <w:pPr>
-        <w:pStyle w:val="Heading2"/>
-      </w:pPr>
-      <w:r>
-        <w:t xml:space="preserve">Second author bio: Jörgen Eksell</w:t>
-      </w:r>
+        <w:t xml:space="preserve">Nils Holmberg holds a PhD in Media and Communication Science from Lund University (2016). His dissertation investigated how web advertising affects children aged 9–12 when solving online tasks, using experimental methods and eye-tracking to assess visual attention and comprehension. The study contributed to understanding the complex digital marketing ecosystem and the use of physiological methods in communication research. His current research focuses on computational content analysis for the social sciences, applying quantitative methods to extract and visualize content features from digital texts and images. This work explores how techniques like natural language processing and computer vision can help analyze communication patterns related to societal issues. Organizational website:</w:t>
+      </w:r>
+      <w:r>
+        <w:t xml:space="preserve"> </w:t>
+      </w:r>
+      <w:hyperlink r:id="rId24">
+        <w:r>
+          <w:rPr>
+            <w:rStyle w:val="Hyperlink"/>
+          </w:rPr>
+          <w:t xml:space="preserve">https://portal.research.lu.se/en/persons/nils-holmberg</w:t>
+        </w:r>
+      </w:hyperlink>
     </w:p>
     <w:bookmarkEnd w:id="25"/>
+    <w:bookmarkStart w:id="26" w:name="second-author-bio-jörgen-eksell"/>
+    <w:p>
+      <w:pPr>
+        <w:pStyle w:val="Heading2"/>
+      </w:pPr>
+      <w:r>
+        <w:t xml:space="preserve">Second author bio: Jörgen Eksell</w:t>
+      </w:r>
+    </w:p>
+    <w:bookmarkEnd w:id="26"/>
     <w:sectPr>
       <w:footnotePr>
         <w:numRestart w:val="eachSect"/>

</xml_diff>